<commit_message>
Polish AI X competition materials
</commit_message>
<xml_diff>
--- a/docs/competition_ai_x/word/01_参赛作品简介_300字.docx
+++ b/docs/competition_ai_x/word/01_参赛作品简介_300字.docx
@@ -7,40 +7,76 @@
         <w:pStyle w:val="Heading1"/>
       </w:pPr>
       <w:r>
-        <w:rPr>
-          <w:rFonts w:ascii="Microsoft YaHei" w:hAnsi="Microsoft YaHei" w:eastAsia="Microsoft YaHei"/>
-          <w:sz w:val="32"/>
-        </w:rPr>
         <w:t>参赛作品简介</w:t>
+      </w:r>
+    </w:p>
+    <w:p/>
+    <w:p>
+      <w:pPr>
+        <w:jc w:val="center"/>
+      </w:pPr>
+      <w:r>
+        <w:drawing>
+          <wp:inline xmlns:a="http://schemas.openxmlformats.org/drawingml/2006/main" xmlns:pic="http://schemas.openxmlformats.org/drawingml/2006/picture">
+            <wp:extent cx="5943600" cy="3467100"/>
+            <wp:docPr id="1" name="Picture 1"/>
+            <wp:cNvGraphicFramePr>
+              <a:graphicFrameLocks noChangeAspect="1"/>
+            </wp:cNvGraphicFramePr>
+            <a:graphic>
+              <a:graphicData uri="http://schemas.openxmlformats.org/drawingml/2006/picture">
+                <pic:pic>
+                  <pic:nvPicPr>
+                    <pic:cNvPr id="0" name="cover_banner.png"/>
+                    <pic:cNvPicPr/>
+                  </pic:nvPicPr>
+                  <pic:blipFill>
+                    <a:blip r:embed="rId9"/>
+                    <a:stretch>
+                      <a:fillRect/>
+                    </a:stretch>
+                  </pic:blipFill>
+                  <pic:spPr>
+                    <a:xfrm>
+                      <a:off x="0" y="0"/>
+                      <a:ext cx="5943600" cy="3467100"/>
+                    </a:xfrm>
+                    <a:prstGeom prst="rect"/>
+                  </pic:spPr>
+                </pic:pic>
+              </a:graphicData>
+            </a:graphic>
+          </wp:inline>
+        </w:drawing>
       </w:r>
     </w:p>
     <w:p>
       <w:pPr>
-        <w:spacing w:line="300" w:lineRule="auto" w:after="120"/>
+        <w:jc w:val="center"/>
       </w:pPr>
       <w:r>
         <w:rPr>
           <w:rFonts w:ascii="Microsoft YaHei" w:hAnsi="Microsoft YaHei" w:eastAsia="Microsoft YaHei"/>
-          <w:sz w:val="22"/>
+          <w:i/>
+          <w:color w:val="576862"/>
+          <w:sz w:val="18"/>
         </w:rPr>
-        <w:t>导出前文件名建议：团队名称_共感LinkAble_参赛作品简介.pdf</w:t>
+        <w:t>共感 LinkAble 封面视觉</w:t>
       </w:r>
     </w:p>
+    <w:p/>
     <w:p>
-      <w:pPr>
-        <w:spacing w:line="300" w:lineRule="auto" w:after="120"/>
-      </w:pPr>
       <w:r>
         <w:rPr>
           <w:rFonts w:ascii="Microsoft YaHei" w:hAnsi="Microsoft YaHei" w:eastAsia="Microsoft YaHei"/>
-          <w:sz w:val="22"/>
+          <w:sz w:val="21"/>
         </w:rPr>
-        <w:t>共感 LinkAble 是面向视障、听障、老年人及临时困难人群的 AI+无障碍互助系统。项目以 AI Agent 作为第一响应入口，统一承接文字、语音、拍照和位置等输入，完成意图识别、紧急程度判断、OCR/药品说明/场景描述等标准化任务；当 AI 低置信、高风险或无法解决现实行动需求时，系统自动转入真人志愿者匹配，并通过 Demo Call 和 SOS 流程形成可追踪的协助闭环。项目创新点在于把大模型能力从“问答工具”转化为“风险分流与服务调度智能体”，兼顾推理效果、无障碍交互、安全降级和公益服务落地。当前原型已完成 AI 对话、志愿者匹配、语音协助、SOS、登录偏好和全局无障碍演示链路，可在无外部 API 条件下稳定运行。</w:t>
+        <w:t>共感 LinkAble 是面向视障、听障、老年人及临时困难人群的 AI+无障碍互助系统。项目把 AI Agent 设计为第一响应入口，统一理解文字、语音、拍照和位置输入，先完成意图识别、风险分流、OCR/药品说明/场景描述等标准化处理；当 AI 低置信、需求复杂或出现紧急信号时，自动转接真人志愿者或进入 SOS 闭环。作品创新点在于将大模型从“问答工具”转化为“公共服务调度智能体”，用 Demo-first 架构保证无外部 API 也能稳定展示 AI 处理、志愿者匹配、语音协助、SOS 和无障碍偏好全流程。</w:t>
       </w:r>
     </w:p>
     <w:sectPr>
       <w:pgSz w:w="12240" w:h="15840"/>
-      <w:pgMar w:top="1247" w:right="1247" w:bottom="1247" w:left="1247" w:header="720" w:footer="720" w:gutter="0"/>
+      <w:pgMar w:top="1020" w:right="1077" w:bottom="1020" w:left="1077" w:header="720" w:footer="720" w:gutter="0"/>
       <w:cols w:space="720"/>
       <w:docGrid w:linePitch="360"/>
     </w:sectPr>
@@ -411,12 +447,9 @@
     <w:name w:val="Normal"/>
     <w:qFormat/>
     <w:rsid w:val="00FC693F"/>
-    <w:pPr>
-      <w:spacing w:line="300" w:lineRule="auto" w:after="120"/>
-    </w:pPr>
     <w:rPr>
       <w:rFonts w:ascii="Microsoft YaHei" w:hAnsi="Microsoft YaHei" w:eastAsia="Microsoft YaHei"/>
-      <w:sz w:val="22"/>
+      <w:sz w:val="21"/>
     </w:rPr>
   </w:style>
   <w:style w:type="paragraph" w:styleId="Header">
@@ -481,8 +514,8 @@
       <w:rFonts w:asciiTheme="majorHAnsi" w:eastAsiaTheme="majorEastAsia" w:hAnsiTheme="majorHAnsi" w:cstheme="majorBidi" w:ascii="Microsoft YaHei" w:hAnsi="Microsoft YaHei" w:eastAsia="Microsoft YaHei"/>
       <w:b/>
       <w:bCs/>
-      <w:color w:val="365F91" w:themeColor="accent1" w:themeShade="BF"/>
-      <w:sz w:val="28"/>
+      <w:color w:val="481F93"/>
+      <w:sz w:val="36"/>
       <w:szCs w:val="28"/>
     </w:rPr>
   </w:style>
@@ -505,8 +538,8 @@
       <w:rFonts w:asciiTheme="majorHAnsi" w:eastAsiaTheme="majorEastAsia" w:hAnsiTheme="majorHAnsi" w:cstheme="majorBidi" w:ascii="Microsoft YaHei" w:hAnsi="Microsoft YaHei" w:eastAsia="Microsoft YaHei"/>
       <w:b/>
       <w:bCs/>
-      <w:color w:val="4F81BD" w:themeColor="accent1"/>
-      <w:sz w:val="26"/>
+      <w:color w:val="481F93"/>
+      <w:sz w:val="30"/>
       <w:szCs w:val="26"/>
     </w:rPr>
   </w:style>
@@ -529,7 +562,8 @@
       <w:rFonts w:asciiTheme="majorHAnsi" w:eastAsiaTheme="majorEastAsia" w:hAnsiTheme="majorHAnsi" w:cstheme="majorBidi" w:ascii="Microsoft YaHei" w:hAnsi="Microsoft YaHei" w:eastAsia="Microsoft YaHei"/>
       <w:b/>
       <w:bCs/>
-      <w:color w:val="4F81BD" w:themeColor="accent1"/>
+      <w:color w:val="142224"/>
+      <w:sz w:val="25"/>
     </w:rPr>
   </w:style>
   <w:style w:type="paragraph" w:styleId="Heading4">
@@ -549,7 +583,7 @@
       <w:outlineLvl w:val="3"/>
     </w:pPr>
     <w:rPr>
-      <w:rFonts w:asciiTheme="majorHAnsi" w:eastAsiaTheme="majorEastAsia" w:hAnsiTheme="majorHAnsi" w:cstheme="majorBidi" w:ascii="Microsoft YaHei" w:hAnsi="Microsoft YaHei" w:eastAsia="Microsoft YaHei"/>
+      <w:rFonts w:asciiTheme="majorHAnsi" w:eastAsiaTheme="majorEastAsia" w:hAnsiTheme="majorHAnsi" w:cstheme="majorBidi"/>
       <w:b/>
       <w:bCs/>
       <w:i/>

</xml_diff>